<commit_message>
thêm phần tìm luật kết hợp
</commit_message>
<xml_diff>
--- a/Ôn thi/RecycleBin/FP growth/Nháp.docx
+++ b/Ôn thi/RecycleBin/FP growth/Nháp.docx
@@ -47,6 +47,23 @@
       </w:pPr>
       <w:r>
         <w:t>Method: call FP-growth(FP-tree, null).</w:t>
+      </w:r>
+    </w:p>
+    <w:p>
+      <w:pPr>
+        <w:jc w:val="left"/>
+      </w:pPr>
+      <w:r>
+        <w:br w:type="page"/>
+      </w:r>
+    </w:p>
+    <w:p>
+      <w:pPr>
+        <w:jc w:val="left"/>
+      </w:pPr>
+      <w:r>
+        <w:lastRenderedPageBreak/>
+        <w:t>Xây cây FP từ bảng giao dịch</w:t>
       </w:r>
     </w:p>
     <w:p>
@@ -104,6 +121,7 @@
         <w:docPartUnique/>
       </w:docPartObj>
     </w:sdtPr>
+    <w:sdtEndPr/>
     <w:sdtContent>
       <w:p>
         <w:pPr>
@@ -3314,6 +3332,7 @@
   <w:style w:type="character" w:default="1" w:styleId="Phngmcinhcuaoanvn">
     <w:name w:val="Default Paragraph Font"/>
     <w:uiPriority w:val="1"/>
+    <w:semiHidden/>
     <w:unhideWhenUsed/>
   </w:style>
   <w:style w:type="table" w:default="1" w:styleId="BangThngthng">

</xml_diff>